<commit_message>
Updated with minotr edits to the table titles, added tables footnotes, and a reference
</commit_message>
<xml_diff>
--- a/Documents/Manuscript.docx
+++ b/Documents/Manuscript.docx
@@ -87,7 +87,7 @@
         <w:t xml:space="preserve"> </w:t>
       </w:r>
       <w:r>
-        <w:t xml:space="preserve">incidence of diag-nosed diabetes in Peru from 2016 to 2023.</w:t>
+        <w:t xml:space="preserve">incidence of diagnosed diabetes in Peru from 2016 to 2023.</w:t>
       </w:r>
     </w:p>
     <w:bookmarkEnd w:id="9"/>
@@ -111,13 +111,13 @@
         <w:t xml:space="preserve"> </w:t>
       </w:r>
       <w:r>
-        <w:t xml:space="preserve">Family Health Sur-vey (ENDES), an annual nationally representative</w:t>
-      </w:r>
-      <w:r>
-        <w:t xml:space="preserve"> </w:t>
-      </w:r>
-      <w:r>
-        <w:t xml:space="preserve">household survey, estimating the preva-lence of self-reported</w:t>
+        <w:t xml:space="preserve">Family Health Survey, an annual nationally representative</w:t>
+      </w:r>
+      <w:r>
+        <w:t xml:space="preserve"> </w:t>
+      </w:r>
+      <w:r>
+        <w:t xml:space="preserve">household survey, estimating the prevalence of self-reported</w:t>
       </w:r>
       <w:r>
         <w:t xml:space="preserve"> </w:t>
@@ -141,7 +141,7 @@
         <w:t xml:space="preserve"> </w:t>
       </w:r>
       <w:r>
-        <w:t xml:space="preserve">which recovers in-cidence from the change in prevalence with age and</w:t>
+        <w:t xml:space="preserve">which recovers incidence from the change in prevalence with age and</w:t>
       </w:r>
       <w:r>
         <w:t xml:space="preserve"> </w:t>
@@ -183,7 +183,7 @@
         <w:t xml:space="preserve"> </w:t>
       </w:r>
       <w:r>
-        <w:t xml:space="preserve">(4.27–6.19) to 9.87 (6.16–16.07) in women. Corresponding IRRs were 1.93</w:t>
+        <w:t xml:space="preserve">(4.27–6.19) to 9.87 (6.16–16.07) in women. Corresponding Incidence Rare Ratios were 1.93</w:t>
       </w:r>
       <w:r>
         <w:t xml:space="preserve"> </w:t>
@@ -195,7 +195,7 @@
         <w:t xml:space="preserve"> </w:t>
       </w:r>
       <w:r>
-        <w:t xml:space="preserve">young-er ages.</w:t>
+        <w:t xml:space="preserve">younger ages.</w:t>
       </w:r>
     </w:p>
     <w:bookmarkEnd w:id="11"/>
@@ -231,7 +231,7 @@
         <w:t xml:space="preserve"> </w:t>
       </w:r>
       <w:r>
-        <w:t xml:space="preserve">while highlighting the value of routine-ly collected survey data for</w:t>
+        <w:t xml:space="preserve">while highlighting the value of routinely collected survey data for</w:t>
       </w:r>
       <w:r>
         <w:t xml:space="preserve"> </w:t>
@@ -574,40 +574,46 @@
         <w:t xml:space="preserve">HbA1c as a diagnostic criterion as well as non representative samples.</w:t>
       </w:r>
       <w:r>
-        <w:t xml:space="preserve"> </w:t>
-      </w:r>
-      <w:r>
-        <w:t xml:space="preserve">Evidence from Peru suggests a particularly high burden. The PERUDIAB</w:t>
-      </w:r>
-      <w:r>
-        <w:t xml:space="preserve"> </w:t>
-      </w:r>
-      <w:r>
-        <w:t xml:space="preserve">study, an urban household cohort of adults aged 25 years or older</w:t>
-      </w:r>
-      <w:r>
-        <w:t xml:space="preserve"> </w:t>
-      </w:r>
-      <w:r>
-        <w:t xml:space="preserve">reported a cumulative incidence of diabetes of 7.2% and an incidence</w:t>
-      </w:r>
-      <w:r>
-        <w:t xml:space="preserve"> </w:t>
-      </w:r>
-      <w:r>
-        <w:t xml:space="preserve">rate of 19.5 new cases per 1,000 person-years [95% confidence interval</w:t>
-      </w:r>
-      <w:r>
-        <w:t xml:space="preserve"> </w:t>
-      </w:r>
-      <w:r>
-        <w:t xml:space="preserve">(95% CI) 13.9 - 28.3].</w:t>
-      </w:r>
-      <w:r>
         <w:rPr>
           <w:vertAlign w:val="superscript"/>
         </w:rPr>
         <w:t xml:space="preserve">8</w:t>
+      </w:r>
+      <w:r>
+        <w:t xml:space="preserve"> </w:t>
+      </w:r>
+      <w:r>
+        <w:t xml:space="preserve">Evidence from Peru suggests a particularly high burden. The PERUDIAB</w:t>
+      </w:r>
+      <w:r>
+        <w:t xml:space="preserve"> </w:t>
+      </w:r>
+      <w:r>
+        <w:t xml:space="preserve">study, an urban household cohort of adults aged 25 years or older</w:t>
+      </w:r>
+      <w:r>
+        <w:t xml:space="preserve"> </w:t>
+      </w:r>
+      <w:r>
+        <w:t xml:space="preserve">reported a cumulative incidence of diabetes of 7.2% and an incidence</w:t>
+      </w:r>
+      <w:r>
+        <w:t xml:space="preserve"> </w:t>
+      </w:r>
+      <w:r>
+        <w:t xml:space="preserve">rate of 19.5 new cases per 1,000 person-years [95% confidence interval</w:t>
+      </w:r>
+      <w:r>
+        <w:t xml:space="preserve"> </w:t>
+      </w:r>
+      <w:r>
+        <w:t xml:space="preserve">(95% CI) 13.9 - 28.3].</w:t>
+      </w:r>
+      <w:r>
+        <w:rPr>
+          <w:vertAlign w:val="superscript"/>
+        </w:rPr>
+        <w:t xml:space="preserve">9</w:t>
       </w:r>
     </w:p>
     <w:p>
@@ -669,7 +675,7 @@
         <w:rPr>
           <w:vertAlign w:val="superscript"/>
         </w:rPr>
-        <w:t xml:space="preserve">9</w:t>
+        <w:t xml:space="preserve">10</w:t>
       </w:r>
       <w:r>
         <w:t xml:space="preserve"> </w:t>
@@ -693,7 +699,7 @@
         <w:rPr>
           <w:vertAlign w:val="superscript"/>
         </w:rPr>
-        <w:t xml:space="preserve">10</w:t>
+        <w:t xml:space="preserve">11</w:t>
       </w:r>
       <w:r>
         <w:t xml:space="preserve"> </w:t>
@@ -774,7 +780,7 @@
         <w:rPr>
           <w:vertAlign w:val="superscript"/>
         </w:rPr>
-        <w:t xml:space="preserve">11</w:t>
+        <w:t xml:space="preserve">3</w:t>
       </w:r>
       <w:r>
         <w:t xml:space="preserve">. It provides</w:t>
@@ -1077,7 +1083,7 @@
         <w:rPr>
           <w:vertAlign w:val="superscript"/>
         </w:rPr>
-        <w:t xml:space="preserve">10</w:t>
+        <w:t xml:space="preserve">11</w:t>
       </w:r>
       <w:r>
         <w:t xml:space="preserve"> </w:t>
@@ -1110,9 +1116,11 @@
       </w:r>
       <w:r>
         <w:rPr>
+          <w:b/>
+          <w:bCs/>
           <w:vertAlign w:val="superscript"/>
         </w:rPr>
-        <w:t xml:space="preserve">13</w:t>
+        <w:t xml:space="preserve">worldpopulation2024?</w:t>
       </w:r>
       <w:r>
         <w:t xml:space="preserve"> </w:t>
@@ -1168,7 +1176,7 @@
         <w:rPr>
           <w:vertAlign w:val="superscript"/>
         </w:rPr>
-        <w:t xml:space="preserve">9,14</w:t>
+        <w:t xml:space="preserve">10,13</w:t>
       </w:r>
       <w:r>
         <w:t xml:space="preserve"> </w:t>
@@ -1224,7 +1232,7 @@
         <w:rPr>
           <w:vertAlign w:val="superscript"/>
         </w:rPr>
-        <w:t xml:space="preserve">9</w:t>
+        <w:t xml:space="preserve">10</w:t>
       </w:r>
       <w:r>
         <w:t xml:space="preserve"> </w:t>
@@ -1733,7 +1741,7 @@
         <w:rPr>
           <w:vertAlign w:val="superscript"/>
         </w:rPr>
-        <w:t xml:space="preserve">15</w:t>
+        <w:t xml:space="preserve">14</w:t>
       </w:r>
       <w:r>
         <w:t xml:space="preserve">.</w:t>
@@ -1823,13 +1831,13 @@
         <w:t xml:space="preserve"> </w:t>
       </w:r>
       <w:r>
-        <w:t xml:space="preserve">diabetes rose from 4.46 (95% CI: 3.61 to 5.23) per 1,000 in 2016 to 8.58</w:t>
-      </w:r>
-      <w:r>
-        <w:t xml:space="preserve"> </w:t>
-      </w:r>
-      <w:r>
-        <w:t xml:space="preserve">(95% CI: 5.27 to 14.41) per 1,000 in 2023, corresponding to an incidence</w:t>
+        <w:t xml:space="preserve">diabetes rose from 4.46 (95% CI: 3.61 to 5.23) per 1,000 person-years in 2016 to 8.58</w:t>
+      </w:r>
+      <w:r>
+        <w:t xml:space="preserve"> </w:t>
+      </w:r>
+      <w:r>
+        <w:t xml:space="preserve">(95% CI: 5.27 to 14.41) per 1,000 person-years in 2023, corresponding to an incidence</w:t>
       </w:r>
       <w:r>
         <w:t xml:space="preserve"> </w:t>
@@ -1847,13 +1855,13 @@
         <w:t xml:space="preserve"> </w:t>
       </w:r>
       <w:r>
-        <w:t xml:space="preserve">4.27 to 6.19) per 1,000 in 2016 to 9.87 (95% CI: 6.16 to 16.07) per</w:t>
-      </w:r>
-      <w:r>
-        <w:t xml:space="preserve"> </w:t>
-      </w:r>
-      <w:r>
-        <w:t xml:space="preserve">1,000 in 2023, with an IRR of 1.92 (95% CI: 1.15 to 3.16) relative to</w:t>
+        <w:t xml:space="preserve">4.27 to 6.19) per 1,000 person-years in 2016 to 9.87 (95% CI: 6.16 to 16.07) per</w:t>
+      </w:r>
+      <w:r>
+        <w:t xml:space="preserve"> </w:t>
+      </w:r>
+      <w:r>
+        <w:t xml:space="preserve">1,000 person-years in 2023, with an IRR of 1.92 (95% CI: 1.15 to 3.16) relative to</w:t>
       </w:r>
       <w:r>
         <w:t xml:space="preserve"> </w:t>
@@ -1891,13 +1899,13 @@
         <w:t xml:space="preserve"> </w:t>
       </w:r>
       <w:r>
-        <w:t xml:space="preserve">to 36.57) per 1,000 among 60-year-old men and 25.76 (95% CI: 16.10 to</w:t>
-      </w:r>
-      <w:r>
-        <w:t xml:space="preserve"> </w:t>
-      </w:r>
-      <w:r>
-        <w:t xml:space="preserve">43.11) per 1,000 among 60-year-old women. However, analysis of the IRR</w:t>
+        <w:t xml:space="preserve">to 36.57) per 1,000 person-years among 60-year-old men and 25.76 (95% CI: 16.10 to</w:t>
+      </w:r>
+      <w:r>
+        <w:t xml:space="preserve"> </w:t>
+      </w:r>
+      <w:r>
+        <w:t xml:space="preserve">43.11) per 1,000 person-years among 60-year-old women. However, analysis of the IRR</w:t>
       </w:r>
       <w:r>
         <w:t xml:space="preserve"> </w:t>
@@ -2019,37 +2027,25 @@
         <w:t xml:space="preserve"> </w:t>
       </w:r>
       <w:r>
-        <w:t xml:space="preserve">comparable with, previous Peruvian cohort studies.The cumulative</w:t>
-      </w:r>
-      <w:r>
-        <w:t xml:space="preserve"> </w:t>
-      </w:r>
-      <w:r>
-        <w:t xml:space="preserve">incidence estimates from our study were smaller than those reported in</w:t>
-      </w:r>
-      <w:r>
-        <w:t xml:space="preserve"> </w:t>
-      </w:r>
-      <w:r>
-        <w:t xml:space="preserve">the PERUDIAB study,</w:t>
+        <w:t xml:space="preserve">comparable with, previous Peruvian cohort studies.The age-standardised incidence rates from our study were lower than those reported in</w:t>
+      </w:r>
+      <w:r>
+        <w:t xml:space="preserve"> </w:t>
+      </w:r>
+      <w:r>
+        <w:t xml:space="preserve">the PERUDIAB,</w:t>
       </w:r>
       <w:r>
         <w:rPr>
           <w:vertAlign w:val="superscript"/>
         </w:rPr>
-        <w:t xml:space="preserve">8</w:t>
-      </w:r>
-      <w:r>
-        <w:t xml:space="preserve"> </w:t>
-      </w:r>
-      <w:r>
-        <w:t xml:space="preserve">but larger than</w:t>
-      </w:r>
-      <w:r>
-        <w:t xml:space="preserve"> </w:t>
-      </w:r>
-      <w:r>
-        <w:t xml:space="preserve">those in the CRONICAS cohort</w:t>
+        <w:t xml:space="preserve">9</w:t>
+      </w:r>
+      <w:r>
+        <w:t xml:space="preserve"> </w:t>
+      </w:r>
+      <w:r>
+        <w:t xml:space="preserve">and the CRONICAS cohort</w:t>
       </w:r>
       <w:r>
         <w:t xml:space="preserve"> </w:t>
@@ -2061,7 +2057,7 @@
         <w:rPr>
           <w:vertAlign w:val="superscript"/>
         </w:rPr>
-        <w:t xml:space="preserve">16</w:t>
+        <w:t xml:space="preserve">15</w:t>
       </w:r>
       <w:r>
         <w:t xml:space="preserve"> </w:t>
@@ -2135,7 +2131,7 @@
         <w:rPr>
           <w:vertAlign w:val="superscript"/>
         </w:rPr>
-        <w:t xml:space="preserve">8</w:t>
+        <w:t xml:space="preserve">9</w:t>
       </w:r>
       <w:r>
         <w:t xml:space="preserve"> </w:t>
@@ -2177,7 +2173,7 @@
         <w:rPr>
           <w:vertAlign w:val="superscript"/>
         </w:rPr>
-        <w:t xml:space="preserve">16</w:t>
+        <w:t xml:space="preserve">15</w:t>
       </w:r>
       <w:r>
         <w:t xml:space="preserve"> </w:t>
@@ -2221,7 +2217,7 @@
         <w:rPr>
           <w:vertAlign w:val="superscript"/>
         </w:rPr>
-        <w:t xml:space="preserve">10</w:t>
+        <w:t xml:space="preserve">11</w:t>
       </w:r>
       <w:r>
         <w:t xml:space="preserve"> </w:t>
@@ -2281,7 +2277,7 @@
         <w:rPr>
           <w:vertAlign w:val="superscript"/>
         </w:rPr>
-        <w:t xml:space="preserve">17</w:t>
+        <w:t xml:space="preserve">16</w:t>
       </w:r>
       <w:r>
         <w:t xml:space="preserve"> </w:t>
@@ -2355,25 +2351,85 @@
         <w:rPr>
           <w:vertAlign w:val="superscript"/>
         </w:rPr>
+        <w:t xml:space="preserve">17</w:t>
+      </w:r>
+      <w:r>
+        <w:t xml:space="preserve"> </w:t>
+      </w:r>
+      <w:r>
+        <w:t xml:space="preserve">and that a large</w:t>
+      </w:r>
+      <w:r>
+        <w:t xml:space="preserve"> </w:t>
+      </w:r>
+      <w:r>
+        <w:t xml:space="preserve">share of Peruvian adults now meet criteria for preclinical or clinical</w:t>
+      </w:r>
+      <w:r>
+        <w:t xml:space="preserve"> </w:t>
+      </w:r>
+      <w:r>
+        <w:t xml:space="preserve">obesity.</w:t>
+      </w:r>
+      <w:r>
+        <w:rPr>
+          <w:vertAlign w:val="superscript"/>
+        </w:rPr>
         <w:t xml:space="preserve">18</w:t>
       </w:r>
       <w:r>
         <w:t xml:space="preserve"> </w:t>
       </w:r>
       <w:r>
-        <w:t xml:space="preserve">and that a large</w:t>
-      </w:r>
-      <w:r>
-        <w:t xml:space="preserve"> </w:t>
-      </w:r>
-      <w:r>
-        <w:t xml:space="preserve">share of Peruvian adults now meet criteria for preclinical or clinical</w:t>
-      </w:r>
-      <w:r>
-        <w:t xml:space="preserve"> </w:t>
-      </w:r>
-      <w:r>
-        <w:t xml:space="preserve">obesity.</w:t>
+        <w:t xml:space="preserve">Because obesity</w:t>
+      </w:r>
+      <w:r>
+        <w:t xml:space="preserve"> </w:t>
+      </w:r>
+      <w:r>
+        <w:t xml:space="preserve">carries the highest attributable risk for diabetes in Peruvian</w:t>
+      </w:r>
+      <w:r>
+        <w:t xml:space="preserve"> </w:t>
+      </w:r>
+      <w:r>
+        <w:t xml:space="preserve">populations,</w:t>
+      </w:r>
+      <w:r>
+        <w:rPr>
+          <w:vertAlign w:val="superscript"/>
+        </w:rPr>
+        <w:t xml:space="preserve">15</w:t>
+      </w:r>
+      <w:r>
+        <w:t xml:space="preserve"> </w:t>
+      </w:r>
+      <w:r>
+        <w:t xml:space="preserve">a</w:t>
+      </w:r>
+      <w:r>
+        <w:t xml:space="preserve"> </w:t>
+      </w:r>
+      <w:r>
+        <w:t xml:space="preserve">rising prevalence of excess adiposity provides a plausible mechanism for</w:t>
+      </w:r>
+      <w:r>
+        <w:t xml:space="preserve"> </w:t>
+      </w:r>
+      <w:r>
+        <w:t xml:space="preserve">the increase in incidence we observed, alongside population ageing,</w:t>
+      </w:r>
+      <w:r>
+        <w:t xml:space="preserve"> </w:t>
+      </w:r>
+      <w:r>
+        <w:t xml:space="preserve">urbanisation, and the broader nutritional transition documented in</w:t>
+      </w:r>
+      <w:r>
+        <w:t xml:space="preserve"> </w:t>
+      </w:r>
+      <w:r>
+        <w:t xml:space="preserve">Peruvian cohorts</w:t>
       </w:r>
       <w:r>
         <w:rPr>
@@ -2382,58 +2438,37 @@
         <w:t xml:space="preserve">19</w:t>
       </w:r>
       <w:r>
-        <w:t xml:space="preserve"> </w:t>
-      </w:r>
-      <w:r>
-        <w:t xml:space="preserve">Because obesity</w:t>
-      </w:r>
-      <w:r>
-        <w:t xml:space="preserve"> </w:t>
-      </w:r>
-      <w:r>
-        <w:t xml:space="preserve">carries the highest attributable risk for diabetes in Peruvian</w:t>
-      </w:r>
-      <w:r>
-        <w:t xml:space="preserve"> </w:t>
-      </w:r>
-      <w:r>
-        <w:t xml:space="preserve">populations,</w:t>
-      </w:r>
-      <w:r>
-        <w:rPr>
-          <w:vertAlign w:val="superscript"/>
-        </w:rPr>
-        <w:t xml:space="preserve">16</w:t>
-      </w:r>
-      <w:r>
-        <w:t xml:space="preserve"> </w:t>
-      </w:r>
-      <w:r>
-        <w:t xml:space="preserve">a</w:t>
-      </w:r>
-      <w:r>
-        <w:t xml:space="preserve"> </w:t>
-      </w:r>
-      <w:r>
-        <w:t xml:space="preserve">rising prevalence of excess adiposity provides a plausible mechanism for</w:t>
-      </w:r>
-      <w:r>
-        <w:t xml:space="preserve"> </w:t>
-      </w:r>
-      <w:r>
-        <w:t xml:space="preserve">the increase in incidence we observed, alongside population ageing,</w:t>
-      </w:r>
-      <w:r>
-        <w:t xml:space="preserve"> </w:t>
-      </w:r>
-      <w:r>
-        <w:t xml:space="preserve">urbanisation, and the broader nutritional transition documented in</w:t>
-      </w:r>
-      <w:r>
-        <w:t xml:space="preserve"> </w:t>
-      </w:r>
-      <w:r>
-        <w:t xml:space="preserve">Peruvian cohorts</w:t>
+        <w:t xml:space="preserve">. We can only</w:t>
+      </w:r>
+      <w:r>
+        <w:t xml:space="preserve"> </w:t>
+      </w:r>
+      <w:r>
+        <w:t xml:space="preserve">speculate that obesity could be a strong driver as our model only took</w:t>
+      </w:r>
+      <w:r>
+        <w:t xml:space="preserve"> </w:t>
+      </w:r>
+      <w:r>
+        <w:t xml:space="preserve">age, sex, and calendar year into account. The proportionally larger</w:t>
+      </w:r>
+      <w:r>
+        <w:t xml:space="preserve"> </w:t>
+      </w:r>
+      <w:r>
+        <w:t xml:space="preserve">increase among younger adults aligns with international evidence that</w:t>
+      </w:r>
+      <w:r>
+        <w:t xml:space="preserve"> </w:t>
+      </w:r>
+      <w:r>
+        <w:t xml:space="preserve">the mean age at type 2 diabetes diagnosis is comparatively low in low-</w:t>
+      </w:r>
+      <w:r>
+        <w:t xml:space="preserve"> </w:t>
+      </w:r>
+      <w:r>
+        <w:t xml:space="preserve">and middle-income settings,</w:t>
       </w:r>
       <w:r>
         <w:rPr>
@@ -2442,73 +2477,34 @@
         <w:t xml:space="preserve">20</w:t>
       </w:r>
       <w:r>
-        <w:t xml:space="preserve">. We can only</w:t>
-      </w:r>
-      <w:r>
-        <w:t xml:space="preserve"> </w:t>
-      </w:r>
-      <w:r>
-        <w:t xml:space="preserve">speculate that obesity could be a strong driver as our model only took</w:t>
-      </w:r>
-      <w:r>
-        <w:t xml:space="preserve"> </w:t>
-      </w:r>
-      <w:r>
-        <w:t xml:space="preserve">age, sex, and calendar year into account. The proportionally larger</w:t>
-      </w:r>
-      <w:r>
-        <w:t xml:space="preserve"> </w:t>
-      </w:r>
-      <w:r>
-        <w:t xml:space="preserve">increase among younger adults aligns with international evidence that</w:t>
-      </w:r>
-      <w:r>
-        <w:t xml:space="preserve"> </w:t>
-      </w:r>
-      <w:r>
-        <w:t xml:space="preserve">the mean age at type 2 diabetes diagnosis is comparatively low in low-</w:t>
-      </w:r>
-      <w:r>
-        <w:t xml:space="preserve"> </w:t>
-      </w:r>
-      <w:r>
-        <w:t xml:space="preserve">and middle-income settings,</w:t>
+        <w:t xml:space="preserve"> </w:t>
+      </w:r>
+      <w:r>
+        <w:t xml:space="preserve">and is of</w:t>
+      </w:r>
+      <w:r>
+        <w:t xml:space="preserve"> </w:t>
+      </w:r>
+      <w:r>
+        <w:t xml:space="preserve">particular concern because earlier onset implies a longer lifetime</w:t>
+      </w:r>
+      <w:r>
+        <w:t xml:space="preserve"> </w:t>
+      </w:r>
+      <w:r>
+        <w:t xml:space="preserve">exposure to hyperglycaemia and a greater cumulative risk of</w:t>
+      </w:r>
+      <w:r>
+        <w:t xml:space="preserve"> </w:t>
+      </w:r>
+      <w:r>
+        <w:t xml:space="preserve">complications.</w:t>
       </w:r>
       <w:r>
         <w:rPr>
           <w:vertAlign w:val="superscript"/>
         </w:rPr>
         <w:t xml:space="preserve">21</w:t>
-      </w:r>
-      <w:r>
-        <w:t xml:space="preserve"> </w:t>
-      </w:r>
-      <w:r>
-        <w:t xml:space="preserve">and is of</w:t>
-      </w:r>
-      <w:r>
-        <w:t xml:space="preserve"> </w:t>
-      </w:r>
-      <w:r>
-        <w:t xml:space="preserve">particular concern because earlier onset implies a longer lifetime</w:t>
-      </w:r>
-      <w:r>
-        <w:t xml:space="preserve"> </w:t>
-      </w:r>
-      <w:r>
-        <w:t xml:space="preserve">exposure to hyperglycaemia and a greater cumulative risk of</w:t>
-      </w:r>
-      <w:r>
-        <w:t xml:space="preserve"> </w:t>
-      </w:r>
-      <w:r>
-        <w:t xml:space="preserve">complications.</w:t>
-      </w:r>
-      <w:r>
-        <w:rPr>
-          <w:vertAlign w:val="superscript"/>
-        </w:rPr>
-        <w:t xml:space="preserve">22</w:t>
       </w:r>
     </w:p>
     <w:p>
@@ -2540,7 +2536,7 @@
         <w:rPr>
           <w:vertAlign w:val="superscript"/>
         </w:rPr>
-        <w:t xml:space="preserve">23</w:t>
+        <w:t xml:space="preserve">22</w:t>
       </w:r>
       <w:r>
         <w:t xml:space="preserve"> </w:t>
@@ -2559,42 +2555,42 @@
       </w:r>
       <w:r>
         <w:t xml:space="preserve">stress at the population level.</w:t>
+      </w:r>
+      <w:r>
+        <w:rPr>
+          <w:vertAlign w:val="superscript"/>
+        </w:rPr>
+        <w:t xml:space="preserve">24</w:t>
+      </w:r>
+      <w:r>
+        <w:t xml:space="preserve"> </w:t>
+      </w:r>
+      <w:r>
+        <w:t xml:space="preserve">At the same time, self-reported</w:t>
+      </w:r>
+      <w:r>
+        <w:t xml:space="preserve"> </w:t>
+      </w:r>
+      <w:r>
+        <w:t xml:space="preserve">diagnosed incidence depends on access to and use of health services. The</w:t>
+      </w:r>
+      <w:r>
+        <w:t xml:space="preserve"> </w:t>
+      </w:r>
+      <w:r>
+        <w:t xml:space="preserve">disruption of routine care in 2020, followed by catch-up diagnosis</w:t>
+      </w:r>
+      <w:r>
+        <w:t xml:space="preserve"> </w:t>
+      </w:r>
+      <w:r>
+        <w:t xml:space="preserve">thereafter,</w:t>
       </w:r>
       <w:r>
         <w:rPr>
           <w:vertAlign w:val="superscript"/>
         </w:rPr>
         <w:t xml:space="preserve">25</w:t>
-      </w:r>
-      <w:r>
-        <w:t xml:space="preserve"> </w:t>
-      </w:r>
-      <w:r>
-        <w:t xml:space="preserve">At the same time, self-reported</w:t>
-      </w:r>
-      <w:r>
-        <w:t xml:space="preserve"> </w:t>
-      </w:r>
-      <w:r>
-        <w:t xml:space="preserve">diagnosed incidence depends on access to and use of health services. The</w:t>
-      </w:r>
-      <w:r>
-        <w:t xml:space="preserve"> </w:t>
-      </w:r>
-      <w:r>
-        <w:t xml:space="preserve">disruption of routine care in 2020, followed by catch-up diagnosis</w:t>
-      </w:r>
-      <w:r>
-        <w:t xml:space="preserve"> </w:t>
-      </w:r>
-      <w:r>
-        <w:t xml:space="preserve">thereafter,</w:t>
-      </w:r>
-      <w:r>
-        <w:rPr>
-          <w:vertAlign w:val="superscript"/>
-        </w:rPr>
-        <w:t xml:space="preserve">26</w:t>
       </w:r>
       <w:r>
         <w:t xml:space="preserve"> </w:t>
@@ -2662,7 +2658,7 @@
         <w:rPr>
           <w:vertAlign w:val="superscript"/>
         </w:rPr>
-        <w:t xml:space="preserve">28</w:t>
+        <w:t xml:space="preserve">27</w:t>
       </w:r>
       <w:r>
         <w:t xml:space="preserve"> </w:t>
@@ -2724,7 +2720,7 @@
         <w:rPr>
           <w:vertAlign w:val="superscript"/>
         </w:rPr>
-        <w:t xml:space="preserve">10</w:t>
+        <w:t xml:space="preserve">11</w:t>
       </w:r>
       <w:r>
         <w:t xml:space="preserve"> </w:t>
@@ -2838,61 +2834,61 @@
         <w:rPr>
           <w:vertAlign w:val="superscript"/>
         </w:rPr>
+        <w:t xml:space="preserve">28</w:t>
+      </w:r>
+      <w:r>
+        <w:t xml:space="preserve"> </w:t>
+      </w:r>
+      <w:r>
+        <w:t xml:space="preserve">Third, no Peruvian</w:t>
+      </w:r>
+      <w:r>
+        <w:t xml:space="preserve"> </w:t>
+      </w:r>
+      <w:r>
+        <w:t xml:space="preserve">estimate of the diabetes-related MRR was available, therefore we rely on</w:t>
+      </w:r>
+      <w:r>
+        <w:t xml:space="preserve"> </w:t>
+      </w:r>
+      <w:r>
+        <w:t xml:space="preserve">data from the National Danish Diabetes</w:t>
+      </w:r>
+      <w:r>
+        <w:t xml:space="preserve"> </w:t>
+      </w:r>
+      <w:r>
+        <w:t xml:space="preserve">Register.</w:t>
+      </w:r>
+      <w:r>
+        <w:rPr>
+          <w:vertAlign w:val="superscript"/>
+        </w:rPr>
         <w:t xml:space="preserve">29</w:t>
       </w:r>
       <w:r>
         <w:t xml:space="preserve"> </w:t>
       </w:r>
       <w:r>
-        <w:t xml:space="preserve">Third, no Peruvian</w:t>
-      </w:r>
-      <w:r>
-        <w:t xml:space="preserve"> </w:t>
-      </w:r>
-      <w:r>
-        <w:t xml:space="preserve">estimate of the diabetes-related MRR was available, therefore we rely on</w:t>
-      </w:r>
-      <w:r>
-        <w:t xml:space="preserve"> </w:t>
-      </w:r>
-      <w:r>
-        <w:t xml:space="preserve">data from the National Danish Diabetes</w:t>
-      </w:r>
-      <w:r>
-        <w:t xml:space="preserve"> </w:t>
-      </w:r>
-      <w:r>
-        <w:t xml:space="preserve">Register.</w:t>
+        <w:t xml:space="preserve">Based on an</w:t>
+      </w:r>
+      <w:r>
+        <w:t xml:space="preserve"> </w:t>
+      </w:r>
+      <w:r>
+        <w:t xml:space="preserve">argument from Breslow &amp; Day, the MRR is stable across different</w:t>
+      </w:r>
+      <w:r>
+        <w:t xml:space="preserve"> </w:t>
+      </w:r>
+      <w:r>
+        <w:t xml:space="preserve">populations.</w:t>
       </w:r>
       <w:r>
         <w:rPr>
           <w:vertAlign w:val="superscript"/>
         </w:rPr>
         <w:t xml:space="preserve">30</w:t>
-      </w:r>
-      <w:r>
-        <w:t xml:space="preserve"> </w:t>
-      </w:r>
-      <w:r>
-        <w:t xml:space="preserve">Based on an</w:t>
-      </w:r>
-      <w:r>
-        <w:t xml:space="preserve"> </w:t>
-      </w:r>
-      <w:r>
-        <w:t xml:space="preserve">argument from Breslow &amp; Day, the MRR is stable across different</w:t>
-      </w:r>
-      <w:r>
-        <w:t xml:space="preserve"> </w:t>
-      </w:r>
-      <w:r>
-        <w:t xml:space="preserve">populations.</w:t>
-      </w:r>
-      <w:r>
-        <w:rPr>
-          <w:vertAlign w:val="superscript"/>
-        </w:rPr>
-        <w:t xml:space="preserve">31</w:t>
       </w:r>
     </w:p>
     <w:p>
@@ -8246,6 +8242,67 @@
           </w:p>
         </w:tc>
       </w:tr>
+      <w:tr>
+        <w:trPr>
+          <w:trHeight w:val="360" w:hRule="auto"/>
+        </w:trPr>
+        footer1
+        <w:tc>
+          <w:tcPr>
+            <w:gridSpan w:val="5"/>
+            <w:tcBorders>
+              <w:bottom w:val="none" w:sz="0" w:space="0" w:color="FFFFFF"/>
+              <w:top w:val="single" w:sz="12" w:space="0" w:color="666666"/>
+              <w:left w:val="none" w:sz="0" w:space="0" w:color="FFFFFF"/>
+              <w:right w:val="none" w:sz="0" w:space="0" w:color="FFFFFF"/>
+            </w:tcBorders>
+            <w:shd w:val="clear" w:color="auto" w:fill="FFFFFF"/>
+            <w:tcMar>
+              <w:top w:w="0" w:type="dxa"/>
+              <w:bottom w:w="0" w:type="dxa"/>
+              <w:left w:w="0" w:type="dxa"/>
+              <w:right w:w="0" w:type="dxa"/>
+            </w:tcMar>
+            <w:vAlign w:val="center"/>
+          </w:tcPr>
+          <w:p>
+            <w:pPr>
+              <w:jc w:val="left"/>
+              <w:pBdr>
+                <w:bottom w:val="none" w:sz="0" w:space="0" w:color="000000"/>
+                <w:top w:val="none" w:sz="0" w:space="0" w:color="000000"/>
+                <w:left w:val="none" w:sz="0" w:space="0" w:color="000000"/>
+                <w:right w:val="none" w:sz="0" w:space="0" w:color="000000"/>
+              </w:pBdr>
+              <w:spacing w:after="100" w:before="100" w:line="240"/>
+              <w:ind w:left="100" w:right="100" w:firstLine="0" w:firstLineChars="0"/>
+              <w:rPr>
+                <w:rFonts w:ascii="Arial" w:hAnsi="Arial" w:eastAsia="Arial" w:cs="Arial"/>
+                <w:i w:val="false"/>
+                <w:b w:val="false"/>
+                <w:u w:val="none"/>
+                <w:strike w:val="false"/>
+                <w:sz w:val="18"/>
+                <w:szCs w:val="18"/>
+                <w:color w:val="000000"/>
+              </w:rPr>
+            </w:pPr>
+            <w:r xmlns:w="http://schemas.openxmlformats.org/wordprocessingml/2006/main" xmlns:wp="http://schemas.openxmlformats.org/drawingml/2006/wordprocessingDrawing" xmlns:r="http://schemas.openxmlformats.org/officeDocument/2006/relationships" xmlns:w14="http://schemas.microsoft.com/office/word/2010/wordml">
+              <w:rPr>
+                <w:rFonts w:ascii="Arial" w:hAnsi="Arial" w:eastAsia="Arial" w:cs="Arial"/>
+                <w:i w:val="false"/>
+                <w:b w:val="false"/>
+                <w:u w:val="none"/>
+                <w:strike w:val="false"/>
+                <w:sz w:val="18"/>
+                <w:szCs w:val="18"/>
+                <w:color w:val="000000"/>
+              </w:rPr>
+              <w:t xml:space="preserve">Incidence rates are per 1000 person-years.</w:t>
+            </w:r>
+          </w:p>
+        </w:tc>
+      </w:tr>
     </w:tbl>
     <w:p>
       <w:r>
@@ -13624,6 +13681,67 @@
           </w:p>
         </w:tc>
       </w:tr>
+      <w:tr>
+        <w:trPr>
+          <w:trHeight w:val="360" w:hRule="auto"/>
+        </w:trPr>
+        footer 1
+        <w:tc>
+          <w:tcPr>
+            <w:gridSpan w:val="6"/>
+            <w:tcBorders>
+              <w:bottom w:val="none" w:sz="0" w:space="0" w:color="FFFFFF"/>
+              <w:top w:val="single" w:sz="12" w:space="0" w:color="666666"/>
+              <w:left w:val="none" w:sz="0" w:space="0" w:color="FFFFFF"/>
+              <w:right w:val="none" w:sz="0" w:space="0" w:color="FFFFFF"/>
+            </w:tcBorders>
+            <w:shd w:val="clear" w:color="auto" w:fill="FFFFFF"/>
+            <w:tcMar>
+              <w:top w:w="0" w:type="dxa"/>
+              <w:bottom w:w="0" w:type="dxa"/>
+              <w:left w:w="0" w:type="dxa"/>
+              <w:right w:w="0" w:type="dxa"/>
+            </w:tcMar>
+            <w:vAlign w:val="center"/>
+          </w:tcPr>
+          <w:p>
+            <w:pPr>
+              <w:jc w:val="left"/>
+              <w:pBdr>
+                <w:bottom w:val="none" w:sz="0" w:space="0" w:color="000000"/>
+                <w:top w:val="none" w:sz="0" w:space="0" w:color="000000"/>
+                <w:left w:val="none" w:sz="0" w:space="0" w:color="000000"/>
+                <w:right w:val="none" w:sz="0" w:space="0" w:color="000000"/>
+              </w:pBdr>
+              <w:spacing w:after="100" w:before="100" w:line="240"/>
+              <w:ind w:left="100" w:right="100" w:firstLine="0" w:firstLineChars="0"/>
+              <w:rPr>
+                <w:rFonts w:ascii="Arial" w:hAnsi="Arial" w:eastAsia="Arial" w:cs="Arial"/>
+                <w:i w:val="false"/>
+                <w:b w:val="false"/>
+                <w:u w:val="none"/>
+                <w:strike w:val="false"/>
+                <w:sz w:val="18"/>
+                <w:szCs w:val="18"/>
+                <w:color w:val="000000"/>
+              </w:rPr>
+            </w:pPr>
+            <w:r xmlns:w="http://schemas.openxmlformats.org/wordprocessingml/2006/main" xmlns:wp="http://schemas.openxmlformats.org/drawingml/2006/wordprocessingDrawing" xmlns:r="http://schemas.openxmlformats.org/officeDocument/2006/relationships" xmlns:w14="http://schemas.microsoft.com/office/word/2010/wordml">
+              <w:rPr>
+                <w:rFonts w:ascii="Arial" w:hAnsi="Arial" w:eastAsia="Arial" w:cs="Arial"/>
+                <w:i w:val="false"/>
+                <w:b w:val="false"/>
+                <w:u w:val="none"/>
+                <w:strike w:val="false"/>
+                <w:sz w:val="18"/>
+                <w:szCs w:val="18"/>
+                <w:color w:val="000000"/>
+              </w:rPr>
+              <w:t xml:space="preserve">Incidence rates are per 1000 person-years.</w:t>
+            </w:r>
+          </w:p>
+        </w:tc>
+      </w:tr>
     </w:tbl>
     <w:p>
       <w:r>
@@ -13632,7 +13750,7 @@
     </w:p>
     <w:bookmarkEnd w:id="34"/>
     <w:bookmarkEnd w:id="35"/>
-    <w:bookmarkStart w:id="98" w:name="references"/>
+    <w:bookmarkStart w:id="90" w:name="references"/>
     <w:p>
       <w:pPr>
         <w:pStyle w:val="Heading1"/>
@@ -13641,8 +13759,8 @@
         <w:t xml:space="preserve">References</w:t>
       </w:r>
     </w:p>
-    <w:bookmarkStart w:id="97" w:name="refs"/>
-    <w:bookmarkStart w:id="37" w:name="ref-maglianoDiabetesAtlas2025"/>
+    <w:bookmarkStart w:id="89" w:name="refs"/>
+    <w:bookmarkStart w:id="36" w:name="ref-maglianoDiabetesAtlas2025"/>
     <w:p>
       <w:pPr>
         <w:pStyle w:val="Bibliography"/>
@@ -13657,7 +13775,7 @@
         <w:t xml:space="preserve">	</w:t>
       </w:r>
       <w:r>
-        <w:t xml:space="preserve">Federation ID.</w:t>
+        <w:t xml:space="preserve">International Diabetes Federation.</w:t>
       </w:r>
       <w:r>
         <w:t xml:space="preserve"> </w:t>
@@ -13667,53 +13785,14 @@
           <w:i/>
           <w:iCs/>
         </w:rPr>
-        <w:t xml:space="preserve">IDF</w:t>
-      </w:r>
-      <w:r>
-        <w:rPr>
-          <w:i/>
-          <w:iCs/>
-        </w:rPr>
-        <w:t xml:space="preserve"> </w:t>
-      </w:r>
-      <w:r>
-        <w:rPr>
-          <w:i/>
-          <w:iCs/>
-        </w:rPr>
-        <w:t xml:space="preserve">Diabetes</w:t>
-      </w:r>
-      <w:r>
-        <w:rPr>
-          <w:i/>
-          <w:iCs/>
-        </w:rPr>
-        <w:t xml:space="preserve"> </w:t>
-      </w:r>
-      <w:r>
-        <w:rPr>
-          <w:i/>
-          <w:iCs/>
-        </w:rPr>
-        <w:t xml:space="preserve">Atlas</w:t>
+        <w:t xml:space="preserve">IDF Diabetes Atlas</w:t>
       </w:r>
       <w:r>
         <w:t xml:space="preserve">. 11th ed. International Diabetes Federation; 2025.</w:t>
       </w:r>
-      <w:r>
-        <w:t xml:space="preserve"> </w:t>
-      </w:r>
-      <w:hyperlink r:id="rId36">
-        <w:r>
-          <w:rPr>
-            <w:rStyle w:val="Hyperlink"/>
-          </w:rPr>
-          <w:t xml:space="preserve">https://diabetesatlas.org</w:t>
-        </w:r>
-      </w:hyperlink>
     </w:p>
-    <w:bookmarkEnd w:id="37"/>
-    <w:bookmarkStart w:id="39" w:name="ref-WorldBankGroup"/>
+    <w:bookmarkEnd w:id="36"/>
+    <w:bookmarkStart w:id="37" w:name="ref-WorldBankGroup"/>
     <w:p>
       <w:pPr>
         <w:pStyle w:val="Bibliography"/>
@@ -13728,7 +13807,7 @@
         <w:t xml:space="preserve">	</w:t>
       </w:r>
       <w:r>
-        <w:t xml:space="preserve">Group WB. World</w:t>
+        <w:t xml:space="preserve">World Bank Group. World</w:t>
       </w:r>
       <w:r>
         <w:t xml:space="preserve"> </w:t>
@@ -13740,22 +13819,11 @@
         <w:t xml:space="preserve"> </w:t>
       </w:r>
       <w:r>
-        <w:t xml:space="preserve">country and lending groups. Published online 2024. Accessed June 17, 2026.</w:t>
-      </w:r>
-      <w:r>
-        <w:t xml:space="preserve"> </w:t>
-      </w:r>
-      <w:hyperlink r:id="rId38">
-        <w:r>
-          <w:rPr>
-            <w:rStyle w:val="Hyperlink"/>
-          </w:rPr>
-          <w:t xml:space="preserve">https://datahelpdesk.worldbank.org/knowledgebase/articles/906519-world-bank-country-and-lending-groups</w:t>
-        </w:r>
-      </w:hyperlink>
+        <w:t xml:space="preserve">country and lending groups. Published online 2024.</w:t>
+      </w:r>
     </w:p>
-    <w:bookmarkEnd w:id="39"/>
-    <w:bookmarkStart w:id="41" w:name="ref-censo"/>
+    <w:bookmarkEnd w:id="37"/>
+    <w:bookmarkStart w:id="38" w:name="ref-censo"/>
     <w:p>
       <w:pPr>
         <w:pStyle w:val="Bibliography"/>
@@ -13770,7 +13838,7 @@
         <w:t xml:space="preserve">	</w:t>
       </w:r>
       <w:r>
-        <w:t xml:space="preserve">Estadística e Informática (INEI) IN de.</w:t>
+        <w:t xml:space="preserve">Instituto Nacional de Estadística e Informática (INEI).</w:t>
       </w:r>
       <w:r>
         <w:t xml:space="preserve"> </w:t>
@@ -13878,39 +13946,14 @@
           <w:i/>
           <w:iCs/>
         </w:rPr>
-        <w:t xml:space="preserve">Primeros</w:t>
-      </w:r>
-      <w:r>
-        <w:rPr>
-          <w:i/>
-          <w:iCs/>
-        </w:rPr>
-        <w:t xml:space="preserve"> </w:t>
-      </w:r>
-      <w:r>
-        <w:rPr>
-          <w:i/>
-          <w:iCs/>
-        </w:rPr>
-        <w:t xml:space="preserve">Resultados</w:t>
-      </w:r>
-      <w:r>
-        <w:t xml:space="preserve">.; 2026. Accessed June 17, 2026.</w:t>
-      </w:r>
-      <w:r>
-        <w:t xml:space="preserve"> </w:t>
-      </w:r>
-      <w:hyperlink r:id="rId40">
-        <w:r>
-          <w:rPr>
-            <w:rStyle w:val="Hyperlink"/>
-          </w:rPr>
-          <w:t xml:space="preserve">https://www.gob.pe/institucion/inei/informes-publicaciones/8200490-peru-crecimiento-y-distribucion-de-la-poblacion-primeros-resultados?utm_source=chatgpt.com</w:t>
-        </w:r>
-      </w:hyperlink>
+        <w:t xml:space="preserve">Primeros Resultados</w:t>
+      </w:r>
+      <w:r>
+        <w:t xml:space="preserve">.; 2026.</w:t>
+      </w:r>
     </w:p>
-    <w:bookmarkEnd w:id="41"/>
-    <w:bookmarkStart w:id="43" w:name="ref-villenaDiabetesMellitusPeru2015"/>
+    <w:bookmarkEnd w:id="38"/>
+    <w:bookmarkStart w:id="40" w:name="ref-villenaDiabetesMellitusPeru2015"/>
     <w:p>
       <w:pPr>
         <w:pStyle w:val="Bibliography"/>
@@ -13961,7 +14004,7 @@
       <w:r>
         <w:t xml:space="preserve">. 2015;81(6):765-775. doi:</w:t>
       </w:r>
-      <w:hyperlink r:id="rId42">
+      <w:hyperlink r:id="rId39">
         <w:r>
           <w:rPr>
             <w:rStyle w:val="Hyperlink"/>
@@ -13970,8 +14013,8 @@
         </w:r>
       </w:hyperlink>
     </w:p>
-    <w:bookmarkEnd w:id="43"/>
-    <w:bookmarkStart w:id="45" w:name="ref-WHO_Peru_2026"/>
+    <w:bookmarkEnd w:id="40"/>
+    <w:bookmarkStart w:id="41" w:name="ref-WHO_Peru_2026"/>
     <w:p>
       <w:pPr>
         <w:pStyle w:val="Bibliography"/>
@@ -13986,37 +14029,20 @@
         <w:t xml:space="preserve">	</w:t>
       </w:r>
       <w:r>
-        <w:t xml:space="preserve">Organization WH. Peru.</w:t>
-      </w:r>
-      <w:r>
-        <w:t xml:space="preserve"> </w:t>
-      </w:r>
-      <w:r>
-        <w:t xml:space="preserve">Country</w:t>
-      </w:r>
-      <w:r>
-        <w:t xml:space="preserve"> </w:t>
-      </w:r>
-      <w:r>
-        <w:t xml:space="preserve">Overview</w:t>
-      </w:r>
-      <w:r>
-        <w:t xml:space="preserve">. Accessed June 17, 2026.</w:t>
-      </w:r>
-      <w:r>
-        <w:t xml:space="preserve"> </w:t>
-      </w:r>
-      <w:hyperlink r:id="rId44">
-        <w:r>
-          <w:rPr>
-            <w:rStyle w:val="Hyperlink"/>
-          </w:rPr>
-          <w:t xml:space="preserve">https://data.who.int/countries/604</w:t>
-        </w:r>
-      </w:hyperlink>
+        <w:t xml:space="preserve">World Health Organization. Peru.</w:t>
+      </w:r>
+      <w:r>
+        <w:t xml:space="preserve"> </w:t>
+      </w:r>
+      <w:r>
+        <w:t xml:space="preserve">Country Overview</w:t>
+      </w:r>
+      <w:r>
+        <w:t xml:space="preserve">.</w:t>
+      </w:r>
     </w:p>
-    <w:bookmarkEnd w:id="45"/>
-    <w:bookmarkStart w:id="47" w:name="Xd956633df2df1358c4cd23ee737a2f50479f232"/>
+    <w:bookmarkEnd w:id="41"/>
+    <w:bookmarkStart w:id="43" w:name="Xd956633df2df1358c4cd23ee737a2f50479f232"/>
     <w:p>
       <w:pPr>
         <w:pStyle w:val="Bibliography"/>
@@ -14055,7 +14081,7 @@
       <w:r>
         <w:t xml:space="preserve">. 2025;17(1):260. doi:</w:t>
       </w:r>
-      <w:hyperlink r:id="rId46">
+      <w:hyperlink r:id="rId42">
         <w:r>
           <w:rPr>
             <w:rStyle w:val="Hyperlink"/>
@@ -14064,8 +14090,8 @@
         </w:r>
       </w:hyperlink>
     </w:p>
-    <w:bookmarkEnd w:id="47"/>
-    <w:bookmarkStart w:id="49" w:name="ref-liuTrendsIncidenceDiabetes2020"/>
+    <w:bookmarkEnd w:id="43"/>
+    <w:bookmarkStart w:id="45" w:name="ref-liuTrendsIncidenceDiabetes2020"/>
     <w:p>
       <w:pPr>
         <w:pStyle w:val="Bibliography"/>
@@ -14086,13 +14112,7 @@
         <w:t xml:space="preserve"> </w:t>
       </w:r>
       <w:r>
-        <w:t xml:space="preserve">Global</w:t>
-      </w:r>
-      <w:r>
-        <w:t xml:space="preserve"> </w:t>
-      </w:r>
-      <w:r>
-        <w:t xml:space="preserve">Burden</w:t>
+        <w:t xml:space="preserve">Global Burden</w:t>
       </w:r>
       <w:r>
         <w:t xml:space="preserve"> </w:t>
@@ -14104,13 +14124,7 @@
         <w:t xml:space="preserve"> </w:t>
       </w:r>
       <w:r>
-        <w:t xml:space="preserve">Disease</w:t>
-      </w:r>
-      <w:r>
-        <w:t xml:space="preserve"> </w:t>
-      </w:r>
-      <w:r>
-        <w:t xml:space="preserve">Study</w:t>
+        <w:t xml:space="preserve">Disease Study</w:t>
       </w:r>
       <w:r>
         <w:t xml:space="preserve"> </w:t>
@@ -14131,7 +14145,7 @@
       <w:r>
         <w:t xml:space="preserve">. 2020;20(1):1415. doi:</w:t>
       </w:r>
-      <w:hyperlink r:id="rId48">
+      <w:hyperlink r:id="rId44">
         <w:r>
           <w:rPr>
             <w:rStyle w:val="Hyperlink"/>
@@ -14140,14 +14154,57 @@
         </w:r>
       </w:hyperlink>
     </w:p>
-    <w:bookmarkEnd w:id="49"/>
-    <w:bookmarkStart w:id="51" w:name="ref-seclenElevatedIncidenceRates2017"/>
+    <w:bookmarkEnd w:id="45"/>
+    <w:bookmarkStart w:id="47" w:name="ref-zhouWorldwideTrendsDiabetes2024"/>
     <w:p>
       <w:pPr>
         <w:pStyle w:val="Bibliography"/>
       </w:pPr>
       <w:r>
         <w:t xml:space="preserve">8.</w:t>
+      </w:r>
+      <w:r>
+        <w:t xml:space="preserve"> </w:t>
+      </w:r>
+      <w:r>
+        <w:t xml:space="preserve">	</w:t>
+      </w:r>
+      <w:r>
+        <w:t xml:space="preserve">Zhou B, Rayner AW, Gregg EW, et al.</w:t>
+      </w:r>
+      <w:r>
+        <w:t xml:space="preserve"> Worldwide trends in diabetes prevalence and treatment from 1990 to 2022: A pooled analysis of 1108 population-representative studies with 141 million participants.</w:t>
+      </w:r>
+      <w:r>
+        <w:t xml:space="preserve"> </w:t>
+      </w:r>
+      <w:r>
+        <w:rPr>
+          <w:i/>
+          <w:iCs/>
+        </w:rPr>
+        <w:t xml:space="preserve">The Lancet</w:t>
+      </w:r>
+      <w:r>
+        <w:t xml:space="preserve">. 2024;404(10467):2077-2093. doi:</w:t>
+      </w:r>
+      <w:hyperlink r:id="rId46">
+        <w:r>
+          <w:rPr>
+            <w:rStyle w:val="Hyperlink"/>
+          </w:rPr>
+          <w:t xml:space="preserve">10.1016/S0140-6736(24)02317-1</w:t>
+        </w:r>
+      </w:hyperlink>
+    </w:p>
+    <w:bookmarkEnd w:id="47"/>
+    <w:bookmarkStart w:id="49" w:name="ref-seclenElevatedIncidenceRates2017"/>
+    <w:p>
+      <w:pPr>
+        <w:pStyle w:val="Bibliography"/>
+      </w:pPr>
+      <w:r>
+        <w:t xml:space="preserve">9.</w:t>
       </w:r>
       <w:r>
         <w:t xml:space="preserve"> </w:t>
@@ -14189,7 +14246,7 @@
       <w:r>
         <w:t xml:space="preserve">. 2017;5(1):e000401. doi:</w:t>
       </w:r>
-      <w:hyperlink r:id="rId50">
+      <w:hyperlink r:id="rId48">
         <w:r>
           <w:rPr>
             <w:rStyle w:val="Hyperlink"/>
@@ -14198,14 +14255,14 @@
         </w:r>
       </w:hyperlink>
     </w:p>
-    <w:bookmarkEnd w:id="51"/>
-    <w:bookmarkStart w:id="53" w:name="ref-brinksAgeTimedependentModel2014"/>
+    <w:bookmarkEnd w:id="49"/>
+    <w:bookmarkStart w:id="51" w:name="ref-brinksAgeTimedependentModel2014"/>
     <w:p>
       <w:pPr>
         <w:pStyle w:val="Bibliography"/>
       </w:pPr>
       <w:r>
-        <w:t xml:space="preserve">9.</w:t>
+        <w:t xml:space="preserve">10.</w:t>
       </w:r>
       <w:r>
         <w:t xml:space="preserve"> </w:t>
@@ -14238,7 +14295,7 @@
       <w:r>
         <w:t xml:space="preserve">. 2014;92:62-68. doi:</w:t>
       </w:r>
-      <w:hyperlink r:id="rId52">
+      <w:hyperlink r:id="rId50">
         <w:r>
           <w:rPr>
             <w:rStyle w:val="Hyperlink"/>
@@ -14247,14 +14304,14 @@
         </w:r>
       </w:hyperlink>
     </w:p>
-    <w:bookmarkEnd w:id="53"/>
-    <w:bookmarkStart w:id="55" w:name="X4dc8aba3bbb83c4de04f523cf34101c1b794956"/>
+    <w:bookmarkEnd w:id="51"/>
+    <w:bookmarkStart w:id="53" w:name="X4dc8aba3bbb83c4de04f523cf34101c1b794956"/>
     <w:p>
       <w:pPr>
         <w:pStyle w:val="Bibliography"/>
       </w:pPr>
       <w:r>
-        <w:t xml:space="preserve">10.</w:t>
+        <w:t xml:space="preserve">11.</w:t>
       </w:r>
       <w:r>
         <w:t xml:space="preserve"> </w:t>
@@ -14290,7 +14347,7 @@
       <w:r>
         <w:t xml:space="preserve">. 2024;24(1):1882. doi:</w:t>
       </w:r>
-      <w:hyperlink r:id="rId54">
+      <w:hyperlink r:id="rId52">
         <w:r>
           <w:rPr>
             <w:rStyle w:val="Hyperlink"/>
@@ -14299,14 +14356,14 @@
         </w:r>
       </w:hyperlink>
     </w:p>
-    <w:bookmarkEnd w:id="55"/>
-    <w:bookmarkStart w:id="57" w:name="X527afb0c18d4e9ef3cfbc95757df377f25536d6"/>
+    <w:bookmarkEnd w:id="53"/>
+    <w:bookmarkStart w:id="54" w:name="ref-EncuestaDemograficaSalud"/>
     <w:p>
       <w:pPr>
         <w:pStyle w:val="Bibliography"/>
       </w:pPr>
       <w:r>
-        <w:t xml:space="preserve">11.</w:t>
+        <w:t xml:space="preserve">12.</w:t>
       </w:r>
       <w:r>
         <w:t xml:space="preserve"> </w:t>
@@ -14315,41 +14372,47 @@
         <w:t xml:space="preserve">	</w:t>
       </w:r>
       <w:r>
-        <w:t xml:space="preserve">Instituto Nacional de Estadística e Informática.</w:t>
-      </w:r>
-      <w:r>
-        <w:t xml:space="preserve"> </w:t>
-      </w:r>
-      <w:r>
-        <w:rPr>
-          <w:i/>
-          <w:iCs/>
-        </w:rPr>
-        <w:t xml:space="preserve">Encuesta Demográfica y de Salud Familiar 2025 Nacional y Departamental</w:t>
-      </w:r>
-      <w:r>
-        <w:t xml:space="preserve">.; 2026.</w:t>
-      </w:r>
-      <w:r>
-        <w:t xml:space="preserve"> </w:t>
-      </w:r>
-      <w:hyperlink r:id="rId56">
-        <w:r>
-          <w:rPr>
-            <w:rStyle w:val="Hyperlink"/>
-          </w:rPr>
-          <w:t xml:space="preserve">https://www.inei.gob.pe/media/MenuRecursivo/publicaciones_digitales/Est/Lib2089/libro.pdf</w:t>
-        </w:r>
-      </w:hyperlink>
+        <w:t xml:space="preserve">Encuesta</w:t>
+      </w:r>
+      <w:r>
+        <w:t xml:space="preserve"> </w:t>
+      </w:r>
+      <w:r>
+        <w:t xml:space="preserve">Demográfica</w:t>
+      </w:r>
+      <w:r>
+        <w:t xml:space="preserve"> </w:t>
+      </w:r>
+      <w:r>
+        <w:t xml:space="preserve">y de</w:t>
+      </w:r>
+      <w:r>
+        <w:t xml:space="preserve"> </w:t>
+      </w:r>
+      <w:r>
+        <w:t xml:space="preserve">Salud Familiar</w:t>
+      </w:r>
+      <w:r>
+        <w:t xml:space="preserve">.</w:t>
+      </w:r>
+      <w:r>
+        <w:t xml:space="preserve"> </w:t>
+      </w:r>
+      <w:r>
+        <w:t xml:space="preserve">ENDES</w:t>
+      </w:r>
+      <w:r>
+        <w:t xml:space="preserve">. Published online 2024.</w:t>
+      </w:r>
     </w:p>
-    <w:bookmarkEnd w:id="57"/>
-    <w:bookmarkStart w:id="59" w:name="ref-EncuestaDemograficaSalud"/>
+    <w:bookmarkEnd w:id="54"/>
+    <w:bookmarkStart w:id="56" w:name="ref-hassAgespecificIncidenceNeed2023"/>
     <w:p>
       <w:pPr>
         <w:pStyle w:val="Bibliography"/>
       </w:pPr>
       <w:r>
-        <w:t xml:space="preserve">12.</w:t>
+        <w:t xml:space="preserve">13.</w:t>
       </w:r>
       <w:r>
         <w:t xml:space="preserve"> </w:t>
@@ -14358,138 +14421,6 @@
         <w:t xml:space="preserve">	</w:t>
       </w:r>
       <w:r>
-        <w:t xml:space="preserve">Encuesta</w:t>
-      </w:r>
-      <w:r>
-        <w:t xml:space="preserve"> </w:t>
-      </w:r>
-      <w:r>
-        <w:t xml:space="preserve">Demográfica</w:t>
-      </w:r>
-      <w:r>
-        <w:t xml:space="preserve"> </w:t>
-      </w:r>
-      <w:r>
-        <w:t xml:space="preserve">y de</w:t>
-      </w:r>
-      <w:r>
-        <w:t xml:space="preserve"> </w:t>
-      </w:r>
-      <w:r>
-        <w:t xml:space="preserve">Salud</w:t>
-      </w:r>
-      <w:r>
-        <w:t xml:space="preserve"> </w:t>
-      </w:r>
-      <w:r>
-        <w:t xml:space="preserve">Familiar</w:t>
-      </w:r>
-      <w:r>
-        <w:t xml:space="preserve">.</w:t>
-      </w:r>
-      <w:r>
-        <w:t xml:space="preserve"> </w:t>
-      </w:r>
-      <w:r>
-        <w:t xml:space="preserve">ENDES</w:t>
-      </w:r>
-      <w:r>
-        <w:t xml:space="preserve">. Published online 2024.</w:t>
-      </w:r>
-      <w:r>
-        <w:t xml:space="preserve"> </w:t>
-      </w:r>
-      <w:hyperlink r:id="rId58">
-        <w:r>
-          <w:rPr>
-            <w:rStyle w:val="Hyperlink"/>
-          </w:rPr>
-          <w:t xml:space="preserve">https://proyectos.inei.gob.pe/endes/index.html</w:t>
-        </w:r>
-      </w:hyperlink>
-    </w:p>
-    <w:bookmarkEnd w:id="59"/>
-    <w:bookmarkStart w:id="61" w:name="ref-worldpopulation2024"/>
-    <w:p>
-      <w:pPr>
-        <w:pStyle w:val="Bibliography"/>
-      </w:pPr>
-      <w:r>
-        <w:t xml:space="preserve">13.</w:t>
-      </w:r>
-      <w:r>
-        <w:t xml:space="preserve"> </w:t>
-      </w:r>
-      <w:r>
-        <w:t xml:space="preserve">	</w:t>
-      </w:r>
-      <w:r>
-        <w:t xml:space="preserve">United Nations PD Department of Economic and Social Affairs. World</w:t>
-      </w:r>
-      <w:r>
-        <w:t xml:space="preserve"> </w:t>
-      </w:r>
-      <w:r>
-        <w:t xml:space="preserve">Population</w:t>
-      </w:r>
-      <w:r>
-        <w:t xml:space="preserve"> </w:t>
-      </w:r>
-      <w:r>
-        <w:t xml:space="preserve">Prospects</w:t>
-      </w:r>
-      <w:r>
-        <w:t xml:space="preserve">:</w:t>
-      </w:r>
-      <w:r>
-        <w:t xml:space="preserve"> </w:t>
-      </w:r>
-      <w:r>
-        <w:t xml:space="preserve">The</w:t>
-      </w:r>
-      <w:r>
-        <w:t xml:space="preserve"> </w:t>
-      </w:r>
-      <w:r>
-        <w:t xml:space="preserve">2024</w:t>
-      </w:r>
-      <w:r>
-        <w:t xml:space="preserve"> </w:t>
-      </w:r>
-      <w:r>
-        <w:t xml:space="preserve">Revision</w:t>
-      </w:r>
-      <w:r>
-        <w:t xml:space="preserve">. Published online 2024.</w:t>
-      </w:r>
-      <w:r>
-        <w:t xml:space="preserve"> </w:t>
-      </w:r>
-      <w:hyperlink r:id="rId60">
-        <w:r>
-          <w:rPr>
-            <w:rStyle w:val="Hyperlink"/>
-          </w:rPr>
-          <w:t xml:space="preserve">https://population.un.org/wpp/</w:t>
-        </w:r>
-      </w:hyperlink>
-    </w:p>
-    <w:bookmarkEnd w:id="61"/>
-    <w:bookmarkStart w:id="63" w:name="ref-hassAgespecificIncidenceNeed2023"/>
-    <w:p>
-      <w:pPr>
-        <w:pStyle w:val="Bibliography"/>
-      </w:pPr>
-      <w:r>
-        <w:t xml:space="preserve">14.</w:t>
-      </w:r>
-      <w:r>
-        <w:t xml:space="preserve"> </w:t>
-      </w:r>
-      <w:r>
-        <w:t xml:space="preserve">	</w:t>
-      </w:r>
-      <w:r>
         <w:t xml:space="preserve">Haß L, Tulka S, Tönnies T, et al. Age-specific incidence of need for long-term care for men and women in</w:t>
       </w:r>
       <w:r>
@@ -14508,10 +14439,13 @@
         <w:t xml:space="preserve"> </w:t>
       </w:r>
       <w:r>
-        <w:t xml:space="preserve">Cross</w:t>
-      </w:r>
-      <w:r>
-        <w:t xml:space="preserve">-sectional study comprising 82 million people.</w:t>
+        <w:t xml:space="preserve">Cross-sectional</w:t>
+      </w:r>
+      <w:r>
+        <w:t xml:space="preserve"> </w:t>
+      </w:r>
+      <w:r>
+        <w:t xml:space="preserve">study comprising 82 million people.</w:t>
       </w:r>
       <w:r>
         <w:t xml:space="preserve"> </w:t>
@@ -14526,7 +14460,7 @@
       <w:r>
         <w:t xml:space="preserve">. 2023;12:102. doi:</w:t>
       </w:r>
-      <w:hyperlink r:id="rId62">
+      <w:hyperlink r:id="rId55">
         <w:r>
           <w:rPr>
             <w:rStyle w:val="Hyperlink"/>
@@ -14535,14 +14469,14 @@
         </w:r>
       </w:hyperlink>
     </w:p>
-    <w:bookmarkEnd w:id="63"/>
-    <w:bookmarkStart w:id="65" w:name="X9908c3c11d2ce7c45992bd046a78b3587daa4e5"/>
+    <w:bookmarkEnd w:id="56"/>
+    <w:bookmarkStart w:id="57" w:name="X9908c3c11d2ce7c45992bd046a78b3587daa4e5"/>
     <w:p>
       <w:pPr>
         <w:pStyle w:val="Bibliography"/>
       </w:pPr>
       <w:r>
-        <w:t xml:space="preserve">15.</w:t>
+        <w:t xml:space="preserve">14.</w:t>
       </w:r>
       <w:r>
         <w:t xml:space="preserve"> </w:t>
@@ -14551,19 +14485,13 @@
         <w:t xml:space="preserve">	</w:t>
       </w:r>
       <w:r>
-        <w:t xml:space="preserve">Team RC. R:</w:t>
-      </w:r>
-      <w:r>
-        <w:t xml:space="preserve"> </w:t>
-      </w:r>
-      <w:r>
-        <w:t xml:space="preserve">A</w:t>
-      </w:r>
-      <w:r>
-        <w:t xml:space="preserve"> </w:t>
-      </w:r>
-      <w:r>
-        <w:t xml:space="preserve">Language</w:t>
+        <w:t xml:space="preserve">R Core Team. R:</w:t>
+      </w:r>
+      <w:r>
+        <w:t xml:space="preserve"> </w:t>
+      </w:r>
+      <w:r>
+        <w:t xml:space="preserve">A Language</w:t>
       </w:r>
       <w:r>
         <w:t xml:space="preserve"> </w:t>
@@ -14587,37 +14515,20 @@
         <w:t xml:space="preserve"> </w:t>
       </w:r>
       <w:r>
-        <w:t xml:space="preserve">Statistical</w:t>
-      </w:r>
-      <w:r>
-        <w:t xml:space="preserve"> </w:t>
-      </w:r>
-      <w:r>
-        <w:t xml:space="preserve">Computing</w:t>
+        <w:t xml:space="preserve">Statistical Computing</w:t>
       </w:r>
       <w:r>
         <w:t xml:space="preserve">. Published online 2023.</w:t>
       </w:r>
-      <w:r>
-        <w:t xml:space="preserve"> </w:t>
-      </w:r>
-      <w:hyperlink r:id="rId64">
-        <w:r>
-          <w:rPr>
-            <w:rStyle w:val="Hyperlink"/>
-          </w:rPr>
-          <w:t xml:space="preserve">https://www.R-project.org/</w:t>
-        </w:r>
-      </w:hyperlink>
     </w:p>
-    <w:bookmarkEnd w:id="65"/>
-    <w:bookmarkStart w:id="67" w:name="Xbec3a6f7601a6bab30c732bf6b26048f2e33c40"/>
+    <w:bookmarkEnd w:id="57"/>
+    <w:bookmarkStart w:id="59" w:name="Xbec3a6f7601a6bab30c732bf6b26048f2e33c40"/>
     <w:p>
       <w:pPr>
         <w:pStyle w:val="Bibliography"/>
       </w:pPr>
       <w:r>
-        <w:t xml:space="preserve">16.</w:t>
+        <w:t xml:space="preserve">15.</w:t>
       </w:r>
       <w:r>
         <w:t xml:space="preserve"> </w:t>
@@ -14641,25 +14552,7 @@
         <w:t xml:space="preserve"> </w:t>
       </w:r>
       <w:r>
-        <w:t xml:space="preserve">The</w:t>
-      </w:r>
-      <w:r>
-        <w:t xml:space="preserve"> </w:t>
-      </w:r>
-      <w:r>
-        <w:t xml:space="preserve">CRONICAS</w:t>
-      </w:r>
-      <w:r>
-        <w:t xml:space="preserve"> </w:t>
-      </w:r>
-      <w:r>
-        <w:t xml:space="preserve">Cohort</w:t>
-      </w:r>
-      <w:r>
-        <w:t xml:space="preserve"> </w:t>
-      </w:r>
-      <w:r>
-        <w:t xml:space="preserve">Study</w:t>
+        <w:t xml:space="preserve">The CRONICAS Cohort Study</w:t>
       </w:r>
       <w:r>
         <w:t xml:space="preserve">.</w:t>
@@ -14677,7 +14570,7 @@
       <w:r>
         <w:t xml:space="preserve">. 2016;121:135-145. doi:</w:t>
       </w:r>
-      <w:hyperlink r:id="rId66">
+      <w:hyperlink r:id="rId58">
         <w:r>
           <w:rPr>
             <w:rStyle w:val="Hyperlink"/>
@@ -14686,14 +14579,14 @@
         </w:r>
       </w:hyperlink>
     </w:p>
-    <w:bookmarkEnd w:id="67"/>
-    <w:bookmarkStart w:id="69" w:name="ref-magliano2019"/>
+    <w:bookmarkEnd w:id="59"/>
+    <w:bookmarkStart w:id="61" w:name="ref-maglianoTrendsIncidenceTotal2019"/>
     <w:p>
       <w:pPr>
         <w:pStyle w:val="Bibliography"/>
       </w:pPr>
       <w:r>
-        <w:t xml:space="preserve">17.</w:t>
+        <w:t xml:space="preserve">16.</w:t>
       </w:r>
       <w:r>
         <w:t xml:space="preserve"> </w:t>
@@ -14715,9 +14608,9 @@
         <w:t xml:space="preserve">BMJ</w:t>
       </w:r>
       <w:r>
-        <w:t xml:space="preserve">. Published online September 11, 2019:l5003. doi:</w:t>
-      </w:r>
-      <w:hyperlink r:id="rId68">
+        <w:t xml:space="preserve">. Published online September 2019:l5003. doi:</w:t>
+      </w:r>
+      <w:hyperlink r:id="rId60">
         <w:r>
           <w:rPr>
             <w:rStyle w:val="Hyperlink"/>
@@ -14726,14 +14619,14 @@
         </w:r>
       </w:hyperlink>
     </w:p>
-    <w:bookmarkEnd w:id="69"/>
-    <w:bookmarkStart w:id="71" w:name="X10cb84c6c1612dda0a1119bca4050847320cc82"/>
+    <w:bookmarkEnd w:id="61"/>
+    <w:bookmarkStart w:id="63" w:name="X10cb84c6c1612dda0a1119bca4050847320cc82"/>
     <w:p>
       <w:pPr>
         <w:pStyle w:val="Bibliography"/>
       </w:pPr>
       <w:r>
-        <w:t xml:space="preserve">18.</w:t>
+        <w:t xml:space="preserve">17.</w:t>
       </w:r>
       <w:r>
         <w:t xml:space="preserve"> </w:t>
@@ -14778,7 +14671,7 @@
       <w:r>
         <w:t xml:space="preserve">. 2025;13:100166. doi:</w:t>
       </w:r>
-      <w:hyperlink r:id="rId70">
+      <w:hyperlink r:id="rId62">
         <w:r>
           <w:rPr>
             <w:rStyle w:val="Hyperlink"/>
@@ -14787,14 +14680,14 @@
         </w:r>
       </w:hyperlink>
     </w:p>
-    <w:bookmarkEnd w:id="71"/>
-    <w:bookmarkStart w:id="73" w:name="Xb43415a205ccf49ab6c8174d9b27251cc1ba2a8"/>
+    <w:bookmarkEnd w:id="63"/>
+    <w:bookmarkStart w:id="65" w:name="Xb43415a205ccf49ab6c8174d9b27251cc1ba2a8"/>
     <w:p>
       <w:pPr>
         <w:pStyle w:val="Bibliography"/>
       </w:pPr>
       <w:r>
-        <w:t xml:space="preserve">19.</w:t>
+        <w:t xml:space="preserve">18.</w:t>
       </w:r>
       <w:r>
         <w:t xml:space="preserve"> </w:t>
@@ -14830,7 +14723,7 @@
       <w:r>
         <w:t xml:space="preserve">. 2025;50:101217. doi:</w:t>
       </w:r>
-      <w:hyperlink r:id="rId72">
+      <w:hyperlink r:id="rId64">
         <w:r>
           <w:rPr>
             <w:rStyle w:val="Hyperlink"/>
@@ -14839,14 +14732,14 @@
         </w:r>
       </w:hyperlink>
     </w:p>
-    <w:bookmarkEnd w:id="73"/>
-    <w:bookmarkStart w:id="75" w:name="Xb4db4d355c438de8a71ccfd2d5e682fe7300785"/>
+    <w:bookmarkEnd w:id="65"/>
+    <w:bookmarkStart w:id="67" w:name="Xb4db4d355c438de8a71ccfd2d5e682fe7300785"/>
     <w:p>
       <w:pPr>
         <w:pStyle w:val="Bibliography"/>
       </w:pPr>
       <w:r>
-        <w:t xml:space="preserve">20.</w:t>
+        <w:t xml:space="preserve">19.</w:t>
       </w:r>
       <w:r>
         <w:t xml:space="preserve"> </w:t>
@@ -14873,19 +14766,7 @@
         <w:t xml:space="preserve"> </w:t>
       </w:r>
       <w:r>
-        <w:t xml:space="preserve">CRONICAS</w:t>
-      </w:r>
-      <w:r>
-        <w:t xml:space="preserve"> </w:t>
-      </w:r>
-      <w:r>
-        <w:t xml:space="preserve">Cohort</w:t>
-      </w:r>
-      <w:r>
-        <w:t xml:space="preserve"> </w:t>
-      </w:r>
-      <w:r>
-        <w:t xml:space="preserve">Study</w:t>
+        <w:t xml:space="preserve">CRONICAS Cohort Study</w:t>
       </w:r>
       <w:r>
         <w:t xml:space="preserve">.</w:t>
@@ -14903,7 +14784,7 @@
       <w:r>
         <w:t xml:space="preserve">. 2018;72(5):397-403. doi:</w:t>
       </w:r>
-      <w:hyperlink r:id="rId74">
+      <w:hyperlink r:id="rId66">
         <w:r>
           <w:rPr>
             <w:rStyle w:val="Hyperlink"/>
@@ -14912,14 +14793,14 @@
         </w:r>
       </w:hyperlink>
     </w:p>
-    <w:bookmarkEnd w:id="75"/>
-    <w:bookmarkStart w:id="77" w:name="ref-lukEarlyonsetType22025"/>
+    <w:bookmarkEnd w:id="67"/>
+    <w:bookmarkStart w:id="69" w:name="ref-lukEarlyonsetType22025"/>
     <w:p>
       <w:pPr>
         <w:pStyle w:val="Bibliography"/>
       </w:pPr>
       <w:r>
-        <w:t xml:space="preserve">21.</w:t>
+        <w:t xml:space="preserve">20.</w:t>
       </w:r>
       <w:r>
         <w:t xml:space="preserve"> </w:t>
@@ -14943,7 +14824,7 @@
       <w:r>
         <w:t xml:space="preserve">. 2025;405(10497):2313-2326. doi:</w:t>
       </w:r>
-      <w:hyperlink r:id="rId76">
+      <w:hyperlink r:id="rId68">
         <w:r>
           <w:rPr>
             <w:rStyle w:val="Hyperlink"/>
@@ -14952,14 +14833,14 @@
         </w:r>
       </w:hyperlink>
     </w:p>
-    <w:bookmarkEnd w:id="77"/>
-    <w:bookmarkStart w:id="79" w:name="Xf8d861e60836fb3144a42af80627b161b03026b"/>
+    <w:bookmarkEnd w:id="69"/>
+    <w:bookmarkStart w:id="71" w:name="Xf8d861e60836fb3144a42af80627b161b03026b"/>
     <w:p>
       <w:pPr>
         <w:pStyle w:val="Bibliography"/>
       </w:pPr>
       <w:r>
-        <w:t xml:space="preserve">22.</w:t>
+        <w:t xml:space="preserve">21.</w:t>
       </w:r>
       <w:r>
         <w:t xml:space="preserve"> </w:t>
@@ -14983,7 +14864,7 @@
       <w:r>
         <w:t xml:space="preserve">. 2025;405(10497):2327-2340. doi:</w:t>
       </w:r>
-      <w:hyperlink r:id="rId78">
+      <w:hyperlink r:id="rId70">
         <w:r>
           <w:rPr>
             <w:rStyle w:val="Hyperlink"/>
@@ -14992,14 +14873,14 @@
         </w:r>
       </w:hyperlink>
     </w:p>
-    <w:bookmarkEnd w:id="79"/>
-    <w:bookmarkStart w:id="81" w:name="ref-xieRisksBurdensIncident2022"/>
+    <w:bookmarkEnd w:id="71"/>
+    <w:bookmarkStart w:id="73" w:name="ref-xieRisksBurdensIncident2022"/>
     <w:p>
       <w:pPr>
         <w:pStyle w:val="Bibliography"/>
       </w:pPr>
       <w:r>
-        <w:t xml:space="preserve">23.</w:t>
+        <w:t xml:space="preserve">22.</w:t>
       </w:r>
       <w:r>
         <w:t xml:space="preserve"> </w:t>
@@ -15032,7 +14913,7 @@
       <w:r>
         <w:t xml:space="preserve">. 2022;10(5):311-321. doi:</w:t>
       </w:r>
-      <w:hyperlink r:id="rId80">
+      <w:hyperlink r:id="rId72">
         <w:r>
           <w:rPr>
             <w:rStyle w:val="Hyperlink"/>
@@ -15041,14 +14922,14 @@
         </w:r>
       </w:hyperlink>
     </w:p>
-    <w:bookmarkEnd w:id="81"/>
-    <w:bookmarkStart w:id="83" w:name="ref-danielsSystematicReviewImpact2022"/>
+    <w:bookmarkEnd w:id="73"/>
+    <w:bookmarkStart w:id="75" w:name="ref-danielsSystematicReviewImpact2022"/>
     <w:p>
       <w:pPr>
         <w:pStyle w:val="Bibliography"/>
       </w:pPr>
       <w:r>
-        <w:t xml:space="preserve">24.</w:t>
+        <w:t xml:space="preserve">23.</w:t>
       </w:r>
       <w:r>
         <w:t xml:space="preserve"> </w:t>
@@ -15063,13 +14944,7 @@
         <w:t xml:space="preserve"> </w:t>
       </w:r>
       <w:r>
-        <w:t xml:space="preserve">Systematic</w:t>
-      </w:r>
-      <w:r>
-        <w:t xml:space="preserve"> </w:t>
-      </w:r>
-      <w:r>
-        <w:t xml:space="preserve">Review</w:t>
+        <w:t xml:space="preserve">Systematic Review</w:t>
       </w:r>
       <w:r>
         <w:t xml:space="preserve"> </w:t>
@@ -15093,13 +14968,7 @@
         <w:t xml:space="preserve"> </w:t>
       </w:r>
       <w:r>
-        <w:t xml:space="preserve">First</w:t>
-      </w:r>
-      <w:r>
-        <w:t xml:space="preserve"> </w:t>
-      </w:r>
-      <w:r>
-        <w:t xml:space="preserve">Year</w:t>
+        <w:t xml:space="preserve">First Year</w:t>
       </w:r>
       <w:r>
         <w:t xml:space="preserve"> </w:t>
@@ -15111,28 +14980,19 @@
         <w:t xml:space="preserve"> </w:t>
       </w:r>
       <w:r>
-        <w:t xml:space="preserve">COVID</w:t>
-      </w:r>
-      <w:r>
-        <w:t xml:space="preserve">-19 on</w:t>
-      </w:r>
-      <w:r>
-        <w:t xml:space="preserve"> </w:t>
-      </w:r>
-      <w:r>
-        <w:t xml:space="preserve">Obesity</w:t>
-      </w:r>
-      <w:r>
-        <w:t xml:space="preserve"> </w:t>
-      </w:r>
-      <w:r>
-        <w:t xml:space="preserve">Risk</w:t>
-      </w:r>
-      <w:r>
-        <w:t xml:space="preserve"> </w:t>
-      </w:r>
-      <w:r>
-        <w:t xml:space="preserve">Factors</w:t>
+        <w:t xml:space="preserve">COVID-19</w:t>
+      </w:r>
+      <w:r>
+        <w:t xml:space="preserve"> </w:t>
+      </w:r>
+      <w:r>
+        <w:t xml:space="preserve">on</w:t>
+      </w:r>
+      <w:r>
+        <w:t xml:space="preserve"> </w:t>
+      </w:r>
+      <w:r>
+        <w:t xml:space="preserve">Obesity Risk Factors</w:t>
       </w:r>
       <w:r>
         <w:t xml:space="preserve">:</w:t>
@@ -15141,19 +15001,7 @@
         <w:t xml:space="preserve"> </w:t>
       </w:r>
       <w:r>
-        <w:t xml:space="preserve">A</w:t>
-      </w:r>
-      <w:r>
-        <w:t xml:space="preserve"> </w:t>
-      </w:r>
-      <w:r>
-        <w:t xml:space="preserve">Pandemic</w:t>
-      </w:r>
-      <w:r>
-        <w:t xml:space="preserve"> </w:t>
-      </w:r>
-      <w:r>
-        <w:t xml:space="preserve">Fueling</w:t>
+        <w:t xml:space="preserve">A Pandemic Fueling</w:t>
       </w:r>
       <w:r>
         <w:t xml:space="preserve"> </w:t>
@@ -15183,7 +15031,7 @@
       <w:r>
         <w:t xml:space="preserve">. 2022;6(4):nzac011. doi:</w:t>
       </w:r>
-      <w:hyperlink r:id="rId82">
+      <w:hyperlink r:id="rId74">
         <w:r>
           <w:rPr>
             <w:rStyle w:val="Hyperlink"/>
@@ -15192,14 +15040,14 @@
         </w:r>
       </w:hyperlink>
     </w:p>
-    <w:bookmarkEnd w:id="83"/>
-    <w:bookmarkStart w:id="85" w:name="ref-nourEffectCOVID19Pandemic2023"/>
+    <w:bookmarkEnd w:id="75"/>
+    <w:bookmarkStart w:id="77" w:name="ref-nourEffectCOVID19Pandemic2023"/>
     <w:p>
       <w:pPr>
         <w:pStyle w:val="Bibliography"/>
       </w:pPr>
       <w:r>
-        <w:t xml:space="preserve">25.</w:t>
+        <w:t xml:space="preserve">24.</w:t>
       </w:r>
       <w:r>
         <w:t xml:space="preserve"> </w:t>
@@ -15214,10 +15062,13 @@
         <w:t xml:space="preserve"> </w:t>
       </w:r>
       <w:r>
-        <w:t xml:space="preserve">COVID</w:t>
-      </w:r>
-      <w:r>
-        <w:t xml:space="preserve">-19 pandemic on obesity and its risk factors: A systematic review.</w:t>
+        <w:t xml:space="preserve">COVID-19</w:t>
+      </w:r>
+      <w:r>
+        <w:t xml:space="preserve"> </w:t>
+      </w:r>
+      <w:r>
+        <w:t xml:space="preserve">pandemic on obesity and its risk factors: A systematic review.</w:t>
       </w:r>
       <w:r>
         <w:t xml:space="preserve"> </w:t>
@@ -15232,7 +15083,7 @@
       <w:r>
         <w:t xml:space="preserve">. 2023;23(1):1018. doi:</w:t>
       </w:r>
-      <w:hyperlink r:id="rId84">
+      <w:hyperlink r:id="rId76">
         <w:r>
           <w:rPr>
             <w:rStyle w:val="Hyperlink"/>
@@ -15241,14 +15092,14 @@
         </w:r>
       </w:hyperlink>
     </w:p>
-    <w:bookmarkEnd w:id="85"/>
-    <w:bookmarkStart w:id="87" w:name="Xd580293c3d8baeae8a74b8aa90e05e5da9ddc0f"/>
+    <w:bookmarkEnd w:id="77"/>
+    <w:bookmarkStart w:id="79" w:name="Xd580293c3d8baeae8a74b8aa90e05e5da9ddc0f"/>
     <w:p>
       <w:pPr>
         <w:pStyle w:val="Bibliography"/>
       </w:pPr>
       <w:r>
-        <w:t xml:space="preserve">26.</w:t>
+        <w:t xml:space="preserve">25.</w:t>
       </w:r>
       <w:r>
         <w:t xml:space="preserve"> </w:t>
@@ -15263,10 +15114,13 @@
         <w:t xml:space="preserve"> </w:t>
       </w:r>
       <w:r>
-        <w:t xml:space="preserve">COVID</w:t>
-      </w:r>
-      <w:r>
-        <w:t xml:space="preserve">-19 on unmet needs for healthcare in</w:t>
+        <w:t xml:space="preserve">COVID-19</w:t>
+      </w:r>
+      <w:r>
+        <w:t xml:space="preserve"> </w:t>
+      </w:r>
+      <w:r>
+        <w:t xml:space="preserve">on unmet needs for healthcare in</w:t>
       </w:r>
       <w:r>
         <w:t xml:space="preserve"> </w:t>
@@ -15290,7 +15144,7 @@
       <w:r>
         <w:t xml:space="preserve">. 2025;5(10):e0005036. doi:</w:t>
       </w:r>
-      <w:hyperlink r:id="rId86">
+      <w:hyperlink r:id="rId78">
         <w:r>
           <w:rPr>
             <w:rStyle w:val="Hyperlink"/>
@@ -15299,14 +15153,14 @@
         </w:r>
       </w:hyperlink>
     </w:p>
-    <w:bookmarkEnd w:id="87"/>
-    <w:bookmarkStart w:id="89" w:name="ref-bakNationalDiabetesRegistries2021"/>
+    <w:bookmarkEnd w:id="79"/>
+    <w:bookmarkStart w:id="81" w:name="ref-bakNationalDiabetesRegistries2021"/>
     <w:p>
       <w:pPr>
         <w:pStyle w:val="Bibliography"/>
       </w:pPr>
       <w:r>
-        <w:t xml:space="preserve">27.</w:t>
+        <w:t xml:space="preserve">26.</w:t>
       </w:r>
       <w:r>
         <w:t xml:space="preserve"> </w:t>
@@ -15330,7 +15184,7 @@
       <w:r>
         <w:t xml:space="preserve">. 2021;58(3):267-278. doi:</w:t>
       </w:r>
-      <w:hyperlink r:id="rId88">
+      <w:hyperlink r:id="rId80">
         <w:r>
           <w:rPr>
             <w:rStyle w:val="Hyperlink"/>
@@ -15339,14 +15193,14 @@
         </w:r>
       </w:hyperlink>
     </w:p>
-    <w:bookmarkEnd w:id="89"/>
-    <w:bookmarkStart w:id="91" w:name="Xa585de8a1f195554251194fa56196c13b875957"/>
+    <w:bookmarkEnd w:id="81"/>
+    <w:bookmarkStart w:id="83" w:name="Xa585de8a1f195554251194fa56196c13b875957"/>
     <w:p>
       <w:pPr>
         <w:pStyle w:val="Bibliography"/>
       </w:pPr>
       <w:r>
-        <w:t xml:space="preserve">28.</w:t>
+        <w:t xml:space="preserve">27.</w:t>
       </w:r>
       <w:r>
         <w:t xml:space="preserve"> </w:t>
@@ -15370,7 +15224,7 @@
       <w:r>
         <w:t xml:space="preserve">. 2023;11(2):70-72. doi:</w:t>
       </w:r>
-      <w:hyperlink r:id="rId90">
+      <w:hyperlink r:id="rId82">
         <w:r>
           <w:rPr>
             <w:rStyle w:val="Hyperlink"/>
@@ -15379,14 +15233,14 @@
         </w:r>
       </w:hyperlink>
     </w:p>
-    <w:bookmarkEnd w:id="91"/>
-    <w:bookmarkStart w:id="93" w:name="ref-gregoryGlobalIncidencePrevalence2022"/>
+    <w:bookmarkEnd w:id="83"/>
+    <w:bookmarkStart w:id="85" w:name="ref-gregoryGlobalIncidencePrevalence2022"/>
     <w:p>
       <w:pPr>
         <w:pStyle w:val="Bibliography"/>
       </w:pPr>
       <w:r>
-        <w:t xml:space="preserve">29.</w:t>
+        <w:t xml:space="preserve">28.</w:t>
       </w:r>
       <w:r>
         <w:t xml:space="preserve"> </w:t>
@@ -15410,7 +15264,7 @@
       <w:r>
         <w:t xml:space="preserve">. 2022;10(10):741-760. doi:</w:t>
       </w:r>
-      <w:hyperlink r:id="rId92">
+      <w:hyperlink r:id="rId84">
         <w:r>
           <w:rPr>
             <w:rStyle w:val="Hyperlink"/>
@@ -15419,14 +15273,14 @@
         </w:r>
       </w:hyperlink>
     </w:p>
-    <w:bookmarkEnd w:id="93"/>
-    <w:bookmarkStart w:id="95" w:name="X792fbaeb3a68c6fc90a36a0aef7680f31dd9e8a"/>
+    <w:bookmarkEnd w:id="85"/>
+    <w:bookmarkStart w:id="87" w:name="X792fbaeb3a68c6fc90a36a0aef7680f31dd9e8a"/>
     <w:p>
       <w:pPr>
         <w:pStyle w:val="Bibliography"/>
       </w:pPr>
       <w:r>
-        <w:t xml:space="preserve">30.</w:t>
+        <w:t xml:space="preserve">29.</w:t>
       </w:r>
       <w:r>
         <w:t xml:space="preserve"> </w:t>
@@ -15462,7 +15316,7 @@
       <w:r>
         <w:t xml:space="preserve">. 2020;8(1):e001071. doi:</w:t>
       </w:r>
-      <w:hyperlink r:id="rId94">
+      <w:hyperlink r:id="rId86">
         <w:r>
           <w:rPr>
             <w:rStyle w:val="Hyperlink"/>
@@ -15471,14 +15325,14 @@
         </w:r>
       </w:hyperlink>
     </w:p>
-    <w:bookmarkEnd w:id="95"/>
-    <w:bookmarkStart w:id="96" w:name="ref-statisticalmethodsincancerresearch"/>
+    <w:bookmarkEnd w:id="87"/>
+    <w:bookmarkStart w:id="88" w:name="ref-statisticalmethodsincancerresearch"/>
     <w:p>
       <w:pPr>
         <w:pStyle w:val="Bibliography"/>
       </w:pPr>
       <w:r>
-        <w:t xml:space="preserve">31.</w:t>
+        <w:t xml:space="preserve">30.</w:t>
       </w:r>
       <w:r>
         <w:t xml:space="preserve"> </w:t>
@@ -15539,49 +15393,7 @@
           <w:i/>
           <w:iCs/>
         </w:rPr>
-        <w:t xml:space="preserve">Cancer</w:t>
-      </w:r>
-      <w:r>
-        <w:rPr>
-          <w:i/>
-          <w:iCs/>
-        </w:rPr>
-        <w:t xml:space="preserve"> </w:t>
-      </w:r>
-      <w:r>
-        <w:rPr>
-          <w:i/>
-          <w:iCs/>
-        </w:rPr>
-        <w:t xml:space="preserve">Research</w:t>
-      </w:r>
-      <w:r>
-        <w:rPr>
-          <w:i/>
-          <w:iCs/>
-        </w:rPr>
-        <w:t xml:space="preserve"> </w:t>
-      </w:r>
-      <w:r>
-        <w:rPr>
-          <w:i/>
-          <w:iCs/>
-        </w:rPr>
-        <w:t xml:space="preserve">Volume</w:t>
-      </w:r>
-      <w:r>
-        <w:rPr>
-          <w:i/>
-          <w:iCs/>
-        </w:rPr>
-        <w:t xml:space="preserve"> </w:t>
-      </w:r>
-      <w:r>
-        <w:rPr>
-          <w:i/>
-          <w:iCs/>
-        </w:rPr>
-        <w:t xml:space="preserve">I</w:t>
+        <w:t xml:space="preserve">Cancer Research Volume I</w:t>
       </w:r>
       <w:r>
         <w:rPr>
@@ -15602,21 +15414,7 @@
           <w:i/>
           <w:iCs/>
         </w:rPr>
-        <w:t xml:space="preserve">The</w:t>
-      </w:r>
-      <w:r>
-        <w:rPr>
-          <w:i/>
-          <w:iCs/>
-        </w:rPr>
-        <w:t xml:space="preserve"> </w:t>
-      </w:r>
-      <w:r>
-        <w:rPr>
-          <w:i/>
-          <w:iCs/>
-        </w:rPr>
-        <w:t xml:space="preserve">Analysis</w:t>
+        <w:t xml:space="preserve">The Analysis</w:t>
       </w:r>
       <w:r>
         <w:rPr>
@@ -15644,43 +15442,15 @@
           <w:i/>
           <w:iCs/>
         </w:rPr>
-        <w:t xml:space="preserve">Case</w:t>
-      </w:r>
-      <w:r>
-        <w:rPr>
-          <w:i/>
-          <w:iCs/>
-        </w:rPr>
-        <w:t xml:space="preserve">-</w:t>
-      </w:r>
-      <w:r>
-        <w:rPr>
-          <w:i/>
-          <w:iCs/>
-        </w:rPr>
-        <w:t xml:space="preserve">Control</w:t>
-      </w:r>
-      <w:r>
-        <w:rPr>
-          <w:i/>
-          <w:iCs/>
-        </w:rPr>
-        <w:t xml:space="preserve"> </w:t>
-      </w:r>
-      <w:r>
-        <w:rPr>
-          <w:i/>
-          <w:iCs/>
-        </w:rPr>
-        <w:t xml:space="preserve">Studies</w:t>
+        <w:t xml:space="preserve">Case-Control Studies</w:t>
       </w:r>
       <w:r>
         <w:t xml:space="preserve">. International Agency for Research on Cancer (IARC); 1980.</w:t>
       </w:r>
     </w:p>
-    <w:bookmarkEnd w:id="96"/>
-    <w:bookmarkEnd w:id="97"/>
-    <w:bookmarkEnd w:id="98"/>
+    <w:bookmarkEnd w:id="88"/>
+    <w:bookmarkEnd w:id="89"/>
+    <w:bookmarkEnd w:id="90"/>
     <w:sectPr>
       <w:footnotePr>
         <w:numRestart w:val="eachSect"/>

</xml_diff>